<commit_message>
Update dataset citation in text and references, and provide exact 300 DPI TIFF and JPEG figures
</commit_message>
<xml_diff>
--- a/manuscript/Manuscript_Clean.docx
+++ b/manuscript/Manuscript_Clean.docx
@@ -2011,106 +2011,9 @@
       </w:pPr>
       <w:r>
         <w:rPr>
-          <w:rFonts w:ascii="Times New Roman" w:hAnsi="Times New Roman" w:cs="Times New Roman"/>
-          <w:lang w:val="en-US"/>
-        </w:rPr>
-        <w:t>This study utilized secondary data from the 2022 Bangladesh Demographic and Health Survey (BDHS 2022), a nationally representative cross-sectional household survey conducted under the global Demographic and Health Survey (DHS) Program. The survey was implemented by the National Institute of Population Research and Training (NIPORT), Bangladesh, in collabor</w:t>
-      </w:r>
-      <w:r>
-        <w:rPr>
-          <w:rFonts w:ascii="Times New Roman" w:hAnsi="Times New Roman" w:cs="Times New Roman"/>
-          <w:lang w:val="en-US"/>
-        </w:rPr>
-        <w:t xml:space="preserve">ation with ICF International </w:t>
-      </w:r>
-      <w:r>
-        <w:rPr>
-          <w:rFonts w:ascii="Times New Roman" w:hAnsi="Times New Roman" w:cs="Times New Roman"/>
-          <w:lang w:val="en-US"/>
-        </w:rPr>
-        <w:fldChar w:fldCharType="begin"/>
-      </w:r>
-      <w:r>
-        <w:rPr>
-          <w:rFonts w:ascii="Times New Roman" w:hAnsi="Times New Roman" w:cs="Times New Roman"/>
-          <w:lang w:val="en-US"/>
-        </w:rPr>
-        <w:instrText xml:space="preserve"> ADDIN ZOTERO_ITEM CSL_CITATION {"citationID":"aHsnBRvH","properties":{"unsorted":false,"formattedCitation":"[9]","plainCitation":"[9]","noteIndex":0},"citationItems":[{"id":303,"uris":["http://zotero.org/users/local/oLOhK0TY/items/GY5YGL9C"],"itemData":{"id":303,"type":"report","publisher":"NIPORT and ICF","publisher-place":"Dhaka, Bangladesh, and Rockville, Maryland, USA","title":"Bangladesh Demographic and Health Survey 2022: Final Report","URL":"https://dhsprogram.com/publications/publication-fr383-dhs-final-reports.cfm","author":[{"literal":"National Institute of Population Research and Training (NIPORT)"},{"literal":"Mitra and Associates"},{"literal":"ICF"}],"issued":{"date-parts":[["2024"]]}}}],"schema":"https://github.com/citation-style-language/schema/raw/master/csl-citation.json"} </w:instrText>
-      </w:r>
-      <w:r>
-        <w:rPr>
-          <w:rFonts w:ascii="Times New Roman" w:hAnsi="Times New Roman" w:cs="Times New Roman"/>
-          <w:lang w:val="en-US"/>
-        </w:rPr>
-        <w:fldChar w:fldCharType="separate"/>
-      </w:r>
-      <w:r>
-        <w:rPr>
-          <w:rFonts w:ascii="Times New Roman" w:hAnsi="Times New Roman" w:cs="Times New Roman"/>
-        </w:rPr>
-        <w:t>[9]</w:t>
-      </w:r>
-      <w:r>
-        <w:rPr>
-          <w:rFonts w:ascii="Times New Roman" w:hAnsi="Times New Roman" w:cs="Times New Roman"/>
-          <w:lang w:val="en-US"/>
-        </w:rPr>
-        <w:fldChar w:fldCharType="end"/>
-      </w:r>
-      <w:r>
-        <w:rPr>
-          <w:rFonts w:ascii="Times New Roman" w:hAnsi="Times New Roman" w:cs="Times New Roman"/>
-          <w:lang w:val="en-US"/>
-        </w:rPr>
-        <w:t>. The BDHS 2022 employed a two-stage stratified cluster sampling design based on the national population census sampling frame. In the first stage, 675 enumeration areas (EAs; 273 urban and 438 rural) were selected with probability proportional to cluster size; 674 EAs were successfully surveyed (one rural EA was inaccessible due to flooding). In the second stage, households were systematically sampled within each selected cluster, from which 30,330 households were selected, 25,481 occupied households interviewed, and 30,078 ever-married women aged 15–49 ye</w:t>
-      </w:r>
-      <w:r>
-        <w:rPr>
-          <w:rFonts w:ascii="Times New Roman" w:hAnsi="Times New Roman" w:cs="Times New Roman"/>
-          <w:lang w:val="en-US"/>
-        </w:rPr>
-        <w:t xml:space="preserve">ars successfully interviewed </w:t>
-      </w:r>
-      <w:r>
-        <w:rPr>
-          <w:rFonts w:ascii="Times New Roman" w:hAnsi="Times New Roman" w:cs="Times New Roman"/>
-          <w:lang w:val="en-US"/>
-        </w:rPr>
-        <w:fldChar w:fldCharType="begin"/>
-      </w:r>
-      <w:r>
-        <w:rPr>
-          <w:rFonts w:ascii="Times New Roman" w:hAnsi="Times New Roman" w:cs="Times New Roman"/>
-          <w:lang w:val="en-US"/>
-        </w:rPr>
-        <w:instrText xml:space="preserve"> ADDIN ZOTERO_ITEM CSL_CITATION {"citationID":"YyRsA1ud","properties":{"unsorted":false,"formattedCitation":"[9]","plainCitation":"[9]","noteIndex":0},"citationItems":[{"id":303,"uris":["http://zotero.org/users/local/oLOhK0TY/items/GY5YGL9C"],"itemData":{"id":303,"type":"report","publisher":"NIPORT and ICF","publisher-place":"Dhaka, Bangladesh, and Rockville, Maryland, USA","title":"Bangladesh Demographic and Health Survey 2022: Final Report","URL":"https://dhsprogram.com/publications/publication-fr383-dhs-final-reports.cfm","author":[{"literal":"National Institute of Population Research and Training (NIPORT)"},{"literal":"Mitra and Associates"},{"literal":"ICF"}],"issued":{"date-parts":[["2024"]]}}}],"schema":"https://github.com/citation-style-language/schema/raw/master/csl-citation.json"} </w:instrText>
-      </w:r>
-      <w:r>
-        <w:rPr>
-          <w:rFonts w:ascii="Times New Roman" w:hAnsi="Times New Roman" w:cs="Times New Roman"/>
-          <w:lang w:val="en-US"/>
-        </w:rPr>
-        <w:fldChar w:fldCharType="separate"/>
-      </w:r>
-      <w:r>
-        <w:rPr>
-          <w:rFonts w:ascii="Times New Roman" w:hAnsi="Times New Roman" w:cs="Times New Roman"/>
-        </w:rPr>
-        <w:t>[9]</w:t>
-      </w:r>
-      <w:r>
-        <w:rPr>
-          <w:rFonts w:ascii="Times New Roman" w:hAnsi="Times New Roman" w:cs="Times New Roman"/>
-          <w:lang w:val="en-US"/>
-        </w:rPr>
-        <w:fldChar w:fldCharType="end"/>
-      </w:r>
-      <w:r>
-        <w:rPr>
-          <w:rFonts w:ascii="Times New Roman" w:hAnsi="Times New Roman" w:cs="Times New Roman"/>
-          <w:lang w:val="en-US"/>
-        </w:rPr>
-        <w:t>.</w:t>
+          <w:rFonts w:ascii="Times New Roman" w:hAnsi="Times New Roman"/>
+        </w:rPr>
+        <w:t>This study utilized secondary data from the 2022 Bangladesh Demographic and Health Survey (BDHS 2022) [dataset] [9], a nationally representative cross-sectional household survey conducted under the global Demographic and Health Survey (DHS) Program. The survey was implemented by the National Institute of Population Research and Training (NIPORT), Bangladesh, in collaboration with ICF International [9]. The BDHS 2022 employed a two-stage stratified cluster sampling design based on the national population census sampling frame. In the first stage, 675 enumeration areas (EAs; 273 urban and 438 rural) were selected with probability proportional to cluster size; 674 EAs were successfully surveyed (one rural EA was inaccessible due to flooding). In the second stage, households were systematically sampled within each selected cluster, from which 30,330 households were selected, 25,481 occupied households interviewed, and 30,078 ever-married women aged 15–49 years successfully interviewed [9].</w:t>
       </w:r>
     </w:p>
     <w:p>
@@ -37881,27 +37784,9 @@
       </w:pPr>
       <w:r>
         <w:rPr>
-          <w:rFonts w:ascii="Times New Roman" w:hAnsi="Times New Roman" w:cs="Times New Roman"/>
-          <w:lang w:bidi="bn-IN"/>
-        </w:rPr>
-        <w:t>The dataset was obtained from the DHS Program website (</w:t>
-      </w:r>
-      <w:hyperlink r:id="rId9" w:history="1">
-        <w:r>
-          <w:rPr>
-            <w:rStyle w:val="Hyperlink"/>
-            <w:rFonts w:ascii="Times New Roman" w:hAnsi="Times New Roman" w:cs="Times New Roman"/>
-            <w:lang w:bidi="bn-IN"/>
-          </w:rPr>
-          <w:t>https://dhsprogram.com/data/available-datasets.cfm</w:t>
-        </w:r>
-      </w:hyperlink>
-      <w:r>
-        <w:rPr>
-          <w:rFonts w:ascii="Times New Roman" w:hAnsi="Times New Roman" w:cs="Times New Roman"/>
-          <w:lang w:bidi="bn-IN"/>
-        </w:rPr>
-        <w:t xml:space="preserve">) in response to a formal request outlining the study objectives. </w:t>
+          <w:rFonts w:ascii="Times New Roman" w:hAnsi="Times New Roman"/>
+        </w:rPr>
+        <w:t>Data are available in a public, open access repository. The dataset analyzed during the current study is publicly available from the DHS Program data repository [dataset] [9] (https://dhsprogram.com/data/available-datasets.cfm).</w:t>
       </w:r>
     </w:p>
     <w:p>
@@ -38220,11 +38105,10 @@
         <w:pStyle w:val="Bibliography"/>
       </w:pPr>
       <w:r>
-        <w:t xml:space="preserve">[dataset] 9 </w:t>
-      </w:r>
-      <w:r>
-        <w:tab/>
-        <w:t>National Institute of Population Research and Training (NIPORT), Mitra and Associates, ICF. Bangladesh Demographic and Health Survey 2022: Final Report. Dhaka, Bangladesh, and Rockville, Maryland, USA: NIPORT and ICF 2024.</w:t>
+        <w:rPr>
+          <w:rFonts w:ascii="Times New Roman" w:hAnsi="Times New Roman"/>
+        </w:rPr>
+        <w:t>[dataset] [9] National Institute of Population Research and Training (NIPORT), Mitra and Associates, ICF. Data from: Bangladesh Demographic and Health Survey 2022 (BDHS 2022). The DHS Program Data Repository, 2024. https://dhsprogram.com/data/available-datasets.cfm</w:t>
       </w:r>
     </w:p>
     <w:p>

</xml_diff>